<commit_message>
Versioning document and re-orginzing folder temp with changes on .gitignore file
</commit_message>
<xml_diff>
--- a/docs/analysis/es/(VI) 20260209 Mexus - SAD (Software Architecture Document).docx
+++ b/docs/analysis/es/(VI) 20260209 Mexus - SAD (Software Architecture Document).docx
@@ -2293,15 +2293,15 @@
     </w:p>
     <w:tbl>
       <w:tblPr>
-        <w:tblStyle w:val="Tablaconcuadrcula3-nfasis1"/>
+        <w:tblStyle w:val="Tablanormal5"/>
         <w:tblW w:w="4794" w:type="pct"/>
         <w:tblLook w:val="04A0" w:firstRow="1" w:lastRow="0" w:firstColumn="1" w:lastColumn="0" w:noHBand="0" w:noVBand="1"/>
       </w:tblPr>
       <w:tblGrid>
         <w:gridCol w:w="1064"/>
         <w:gridCol w:w="1389"/>
-        <w:gridCol w:w="5956"/>
-        <w:gridCol w:w="1212"/>
+        <w:gridCol w:w="5957"/>
+        <w:gridCol w:w="1211"/>
       </w:tblGrid>
       <w:tr>
         <w:trPr>
@@ -2311,19 +2311,24 @@
           <w:tcPr>
             <w:cnfStyle w:val="001000000100" w:firstRow="0" w:lastRow="0" w:firstColumn="1" w:lastColumn="0" w:oddVBand="0" w:evenVBand="0" w:oddHBand="0" w:evenHBand="0" w:firstRowFirstColumn="1" w:firstRowLastColumn="0" w:lastRowFirstColumn="0" w:lastRowLastColumn="0"/>
             <w:tcW w:w="553" w:type="pct"/>
+            <w:tcBorders>
+              <w:bottom w:val="single" w:sz="12" w:space="0" w:color="4E91CD"/>
+            </w:tcBorders>
             <w:hideMark/>
           </w:tcPr>
           <w:p>
             <w:pPr>
               <w:pStyle w:val="Contenido"/>
               <w:rPr>
-                <w:b w:val="0"/>
+                <w:rFonts w:asciiTheme="minorHAnsi" w:hAnsiTheme="minorHAnsi" w:cstheme="minorHAnsi"/>
+                <w:bCs/>
               </w:rPr>
             </w:pPr>
             <w:r>
               <w:rPr>
                 <w:rStyle w:val="Fuerte"/>
-                <w:b/>
+                <w:rFonts w:asciiTheme="minorHAnsi" w:hAnsiTheme="minorHAnsi" w:cstheme="minorHAnsi"/>
+                <w:bCs w:val="0"/>
               </w:rPr>
               <w:t>Versión</w:t>
             </w:r>
@@ -2332,6 +2337,9 @@
         <w:tc>
           <w:tcPr>
             <w:tcW w:w="722" w:type="pct"/>
+            <w:tcBorders>
+              <w:bottom w:val="single" w:sz="12" w:space="0" w:color="4E91CD"/>
+            </w:tcBorders>
             <w:hideMark/>
           </w:tcPr>
           <w:p>
@@ -2339,13 +2347,15 @@
               <w:pStyle w:val="Contenido"/>
               <w:cnfStyle w:val="100000000000" w:firstRow="1" w:lastRow="0" w:firstColumn="0" w:lastColumn="0" w:oddVBand="0" w:evenVBand="0" w:oddHBand="0" w:evenHBand="0" w:firstRowFirstColumn="0" w:firstRowLastColumn="0" w:lastRowFirstColumn="0" w:lastRowLastColumn="0"/>
               <w:rPr>
-                <w:b w:val="0"/>
+                <w:rFonts w:asciiTheme="minorHAnsi" w:hAnsiTheme="minorHAnsi" w:cstheme="minorHAnsi"/>
+                <w:bCs/>
               </w:rPr>
             </w:pPr>
             <w:r>
               <w:rPr>
                 <w:rStyle w:val="Fuerte"/>
-                <w:b/>
+                <w:rFonts w:asciiTheme="minorHAnsi" w:hAnsiTheme="minorHAnsi" w:cstheme="minorHAnsi"/>
+                <w:bCs w:val="0"/>
               </w:rPr>
               <w:t>Fecha</w:t>
             </w:r>
@@ -2354,6 +2364,9 @@
         <w:tc>
           <w:tcPr>
             <w:tcW w:w="0" w:type="auto"/>
+            <w:tcBorders>
+              <w:bottom w:val="single" w:sz="12" w:space="0" w:color="4E91CD"/>
+            </w:tcBorders>
             <w:hideMark/>
           </w:tcPr>
           <w:p>
@@ -2361,13 +2374,15 @@
               <w:pStyle w:val="Contenido"/>
               <w:cnfStyle w:val="100000000000" w:firstRow="1" w:lastRow="0" w:firstColumn="0" w:lastColumn="0" w:oddVBand="0" w:evenVBand="0" w:oddHBand="0" w:evenHBand="0" w:firstRowFirstColumn="0" w:firstRowLastColumn="0" w:lastRowFirstColumn="0" w:lastRowLastColumn="0"/>
               <w:rPr>
-                <w:b w:val="0"/>
+                <w:rFonts w:asciiTheme="minorHAnsi" w:hAnsiTheme="minorHAnsi" w:cstheme="minorHAnsi"/>
+                <w:bCs/>
               </w:rPr>
             </w:pPr>
             <w:r>
               <w:rPr>
                 <w:rStyle w:val="Fuerte"/>
-                <w:b/>
+                <w:rFonts w:asciiTheme="minorHAnsi" w:hAnsiTheme="minorHAnsi" w:cstheme="minorHAnsi"/>
+                <w:bCs w:val="0"/>
               </w:rPr>
               <w:t>Cambios realizados</w:t>
             </w:r>
@@ -2376,6 +2391,9 @@
         <w:tc>
           <w:tcPr>
             <w:tcW w:w="0" w:type="auto"/>
+            <w:tcBorders>
+              <w:bottom w:val="single" w:sz="12" w:space="0" w:color="4E91CD"/>
+            </w:tcBorders>
             <w:hideMark/>
           </w:tcPr>
           <w:p>
@@ -2383,13 +2401,15 @@
               <w:pStyle w:val="Contenido"/>
               <w:cnfStyle w:val="100000000000" w:firstRow="1" w:lastRow="0" w:firstColumn="0" w:lastColumn="0" w:oddVBand="0" w:evenVBand="0" w:oddHBand="0" w:evenHBand="0" w:firstRowFirstColumn="0" w:firstRowLastColumn="0" w:lastRowFirstColumn="0" w:lastRowLastColumn="0"/>
               <w:rPr>
-                <w:b w:val="0"/>
+                <w:rFonts w:asciiTheme="minorHAnsi" w:hAnsiTheme="minorHAnsi" w:cstheme="minorHAnsi"/>
+                <w:bCs/>
               </w:rPr>
             </w:pPr>
             <w:r>
               <w:rPr>
                 <w:rStyle w:val="Fuerte"/>
-                <w:b/>
+                <w:rFonts w:asciiTheme="minorHAnsi" w:hAnsiTheme="minorHAnsi" w:cstheme="minorHAnsi"/>
+                <w:bCs w:val="0"/>
               </w:rPr>
               <w:t>Autor</w:t>
             </w:r>
@@ -2405,6 +2425,10 @@
           <w:tcPr>
             <w:cnfStyle w:val="001000000000" w:firstRow="0" w:lastRow="0" w:firstColumn="1" w:lastColumn="0" w:oddVBand="0" w:evenVBand="0" w:oddHBand="0" w:evenHBand="0" w:firstRowFirstColumn="0" w:firstRowLastColumn="0" w:lastRowFirstColumn="0" w:lastRowLastColumn="0"/>
             <w:tcW w:w="553" w:type="pct"/>
+            <w:tcBorders>
+              <w:top w:val="single" w:sz="12" w:space="0" w:color="4E91CD"/>
+              <w:right w:val="single" w:sz="2" w:space="0" w:color="4E91CD"/>
+            </w:tcBorders>
             <w:hideMark/>
           </w:tcPr>
           <w:p>
@@ -2461,7 +2485,13 @@
               <w:rPr>
                 <w:rStyle w:val="Hipervnculo"/>
               </w:rPr>
-              <w:t>1.0</w:t>
+              <w:t>0.1</w:t>
+            </w:r>
+            <w:r>
+              <w:rPr>
+                <w:rStyle w:val="Hipervnculo"/>
+              </w:rPr>
+              <w:t>.0</w:t>
             </w:r>
             <w:bookmarkEnd w:id="4"/>
             <w:r>
@@ -2479,7 +2509,11 @@
         <w:tc>
           <w:tcPr>
             <w:tcW w:w="722" w:type="pct"/>
-            <w:shd w:val="clear" w:color="auto" w:fill="4E91CD"/>
+            <w:tcBorders>
+              <w:top w:val="single" w:sz="12" w:space="0" w:color="4E91CD"/>
+              <w:left w:val="single" w:sz="2" w:space="0" w:color="4E91CD"/>
+              <w:bottom w:val="single" w:sz="2" w:space="0" w:color="4E91CD"/>
+            </w:tcBorders>
             <w:hideMark/>
           </w:tcPr>
           <w:p>
@@ -2488,41 +2522,35 @@
               <w:cnfStyle w:val="000000100000" w:firstRow="0" w:lastRow="0" w:firstColumn="0" w:lastColumn="0" w:oddVBand="0" w:evenVBand="0" w:oddHBand="1" w:evenHBand="0" w:firstRowFirstColumn="0" w:firstRowLastColumn="0" w:lastRowFirstColumn="0" w:lastRowLastColumn="0"/>
               <w:rPr>
                 <w:i/>
-                <w:color w:val="FFFFFF" w:themeColor="background1"/>
               </w:rPr>
             </w:pPr>
             <w:r>
               <w:rPr>
                 <w:i/>
-                <w:color w:val="FFFFFF" w:themeColor="background1"/>
               </w:rPr>
               <w:t>10</w:t>
             </w:r>
             <w:r>
               <w:rPr>
                 <w:i/>
-                <w:color w:val="FFFFFF" w:themeColor="background1"/>
               </w:rPr>
               <w:t>/0</w:t>
             </w:r>
             <w:r>
               <w:rPr>
                 <w:i/>
-                <w:color w:val="FFFFFF" w:themeColor="background1"/>
               </w:rPr>
               <w:t>2</w:t>
             </w:r>
             <w:r>
               <w:rPr>
                 <w:i/>
-                <w:color w:val="FFFFFF" w:themeColor="background1"/>
               </w:rPr>
               <w:t>/202</w:t>
             </w:r>
             <w:r>
               <w:rPr>
                 <w:i/>
-                <w:color w:val="FFFFFF" w:themeColor="background1"/>
               </w:rPr>
               <w:t>6</w:t>
             </w:r>
@@ -2531,7 +2559,10 @@
         <w:tc>
           <w:tcPr>
             <w:tcW w:w="0" w:type="auto"/>
-            <w:shd w:val="clear" w:color="auto" w:fill="4E91CD"/>
+            <w:tcBorders>
+              <w:top w:val="single" w:sz="12" w:space="0" w:color="4E91CD"/>
+              <w:bottom w:val="single" w:sz="2" w:space="0" w:color="4E91CD"/>
+            </w:tcBorders>
             <w:hideMark/>
           </w:tcPr>
           <w:p>
@@ -2542,7 +2573,6 @@
                 <w:b/>
                 <w:bCs/>
                 <w:i/>
-                <w:color w:val="FFFFFF" w:themeColor="background1"/>
               </w:rPr>
             </w:pPr>
             <w:r>
@@ -2550,7 +2580,6 @@
                 <w:b/>
                 <w:bCs/>
                 <w:i/>
-                <w:color w:val="FFFFFF" w:themeColor="background1"/>
               </w:rPr>
               <w:t>Documento inicial creado</w:t>
             </w:r>
@@ -2563,7 +2592,6 @@
                 <w:b/>
                 <w:bCs/>
                 <w:i/>
-                <w:color w:val="FFFFFF" w:themeColor="background1"/>
               </w:rPr>
             </w:pPr>
           </w:p>
@@ -2577,14 +2605,12 @@
               <w:ind w:left="244" w:hanging="244"/>
               <w:cnfStyle w:val="000000100000" w:firstRow="0" w:lastRow="0" w:firstColumn="0" w:lastColumn="0" w:oddVBand="0" w:evenVBand="0" w:oddHBand="1" w:evenHBand="0" w:firstRowFirstColumn="0" w:firstRowLastColumn="0" w:lastRowFirstColumn="0" w:lastRowLastColumn="0"/>
               <w:rPr>
-                <w:color w:val="FFFFFF" w:themeColor="background1"/>
                 <w:sz w:val="18"/>
                 <w:szCs w:val="18"/>
               </w:rPr>
             </w:pPr>
             <w:r>
               <w:rPr>
-                <w:color w:val="FFFFFF" w:themeColor="background1"/>
                 <w:sz w:val="18"/>
                 <w:szCs w:val="18"/>
               </w:rPr>
@@ -2601,14 +2627,12 @@
               <w:ind w:left="244" w:hanging="244"/>
               <w:cnfStyle w:val="000000100000" w:firstRow="0" w:lastRow="0" w:firstColumn="0" w:lastColumn="0" w:oddVBand="0" w:evenVBand="0" w:oddHBand="1" w:evenHBand="0" w:firstRowFirstColumn="0" w:firstRowLastColumn="0" w:lastRowFirstColumn="0" w:lastRowLastColumn="0"/>
               <w:rPr>
-                <w:color w:val="FFFFFF" w:themeColor="background1"/>
                 <w:sz w:val="18"/>
                 <w:szCs w:val="18"/>
               </w:rPr>
             </w:pPr>
             <w:r>
               <w:rPr>
-                <w:color w:val="FFFFFF" w:themeColor="background1"/>
                 <w:sz w:val="18"/>
                 <w:szCs w:val="18"/>
               </w:rPr>
@@ -2625,14 +2649,12 @@
               <w:ind w:left="244" w:hanging="244"/>
               <w:cnfStyle w:val="000000100000" w:firstRow="0" w:lastRow="0" w:firstColumn="0" w:lastColumn="0" w:oddVBand="0" w:evenVBand="0" w:oddHBand="1" w:evenHBand="0" w:firstRowFirstColumn="0" w:firstRowLastColumn="0" w:lastRowFirstColumn="0" w:lastRowLastColumn="0"/>
               <w:rPr>
-                <w:color w:val="FFFFFF" w:themeColor="background1"/>
                 <w:sz w:val="18"/>
                 <w:szCs w:val="18"/>
               </w:rPr>
             </w:pPr>
             <w:r>
               <w:rPr>
-                <w:color w:val="FFFFFF" w:themeColor="background1"/>
                 <w:sz w:val="18"/>
                 <w:szCs w:val="18"/>
               </w:rPr>
@@ -2649,14 +2671,12 @@
               <w:ind w:left="244" w:hanging="244"/>
               <w:cnfStyle w:val="000000100000" w:firstRow="0" w:lastRow="0" w:firstColumn="0" w:lastColumn="0" w:oddVBand="0" w:evenVBand="0" w:oddHBand="1" w:evenHBand="0" w:firstRowFirstColumn="0" w:firstRowLastColumn="0" w:lastRowFirstColumn="0" w:lastRowLastColumn="0"/>
               <w:rPr>
-                <w:color w:val="FFFFFF" w:themeColor="background1"/>
                 <w:sz w:val="18"/>
                 <w:szCs w:val="18"/>
               </w:rPr>
             </w:pPr>
             <w:r>
               <w:rPr>
-                <w:color w:val="FFFFFF" w:themeColor="background1"/>
                 <w:sz w:val="18"/>
                 <w:szCs w:val="18"/>
               </w:rPr>
@@ -2673,14 +2693,12 @@
               <w:ind w:left="244" w:hanging="244"/>
               <w:cnfStyle w:val="000000100000" w:firstRow="0" w:lastRow="0" w:firstColumn="0" w:lastColumn="0" w:oddVBand="0" w:evenVBand="0" w:oddHBand="1" w:evenHBand="0" w:firstRowFirstColumn="0" w:firstRowLastColumn="0" w:lastRowFirstColumn="0" w:lastRowLastColumn="0"/>
               <w:rPr>
-                <w:color w:val="FFFFFF" w:themeColor="background1"/>
                 <w:sz w:val="18"/>
                 <w:szCs w:val="18"/>
               </w:rPr>
             </w:pPr>
             <w:r>
               <w:rPr>
-                <w:color w:val="FFFFFF" w:themeColor="background1"/>
                 <w:sz w:val="18"/>
                 <w:szCs w:val="18"/>
               </w:rPr>
@@ -2692,7 +2710,6 @@
               <w:pStyle w:val="Contenido"/>
               <w:cnfStyle w:val="000000100000" w:firstRow="0" w:lastRow="0" w:firstColumn="0" w:lastColumn="0" w:oddVBand="0" w:evenVBand="0" w:oddHBand="1" w:evenHBand="0" w:firstRowFirstColumn="0" w:firstRowLastColumn="0" w:lastRowFirstColumn="0" w:lastRowLastColumn="0"/>
               <w:rPr>
-                <w:color w:val="FFFFFF" w:themeColor="background1"/>
                 <w:sz w:val="18"/>
                 <w:szCs w:val="18"/>
               </w:rPr>
@@ -2702,7 +2719,11 @@
         <w:tc>
           <w:tcPr>
             <w:tcW w:w="0" w:type="auto"/>
-            <w:shd w:val="clear" w:color="auto" w:fill="4E91CD"/>
+            <w:tcBorders>
+              <w:top w:val="single" w:sz="12" w:space="0" w:color="4E91CD"/>
+              <w:bottom w:val="single" w:sz="2" w:space="0" w:color="4E91CD"/>
+              <w:right w:val="single" w:sz="2" w:space="0" w:color="4E91CD"/>
+            </w:tcBorders>
             <w:hideMark/>
           </w:tcPr>
           <w:p>
@@ -2712,14 +2733,12 @@
               <w:rPr>
                 <w:i/>
                 <w:iCs/>
-                <w:color w:val="FFFFFF" w:themeColor="background1"/>
               </w:rPr>
             </w:pPr>
             <w:r>
               <w:rPr>
                 <w:i/>
                 <w:iCs/>
-                <w:color w:val="FFFFFF" w:themeColor="background1"/>
               </w:rPr>
               <w:t>dcueli</w:t>
             </w:r>
@@ -2731,6 +2750,9 @@
           <w:tcPr>
             <w:cnfStyle w:val="001000000000" w:firstRow="0" w:lastRow="0" w:firstColumn="1" w:lastColumn="0" w:oddVBand="0" w:evenVBand="0" w:oddHBand="0" w:evenHBand="0" w:firstRowFirstColumn="0" w:firstRowLastColumn="0" w:lastRowFirstColumn="0" w:lastRowLastColumn="0"/>
             <w:tcW w:w="553" w:type="pct"/>
+            <w:tcBorders>
+              <w:right w:val="single" w:sz="2" w:space="0" w:color="4E91CD"/>
+            </w:tcBorders>
             <w:hideMark/>
           </w:tcPr>
           <w:p>
@@ -2742,6 +2764,11 @@
         <w:tc>
           <w:tcPr>
             <w:tcW w:w="722" w:type="pct"/>
+            <w:tcBorders>
+              <w:top w:val="single" w:sz="2" w:space="0" w:color="4E91CD"/>
+              <w:left w:val="single" w:sz="2" w:space="0" w:color="4E91CD"/>
+              <w:bottom w:val="single" w:sz="2" w:space="0" w:color="4E91CD"/>
+            </w:tcBorders>
           </w:tcPr>
           <w:p>
             <w:pPr>
@@ -2781,6 +2808,10 @@
         <w:tc>
           <w:tcPr>
             <w:tcW w:w="0" w:type="auto"/>
+            <w:tcBorders>
+              <w:top w:val="single" w:sz="2" w:space="0" w:color="4E91CD"/>
+              <w:bottom w:val="single" w:sz="2" w:space="0" w:color="4E91CD"/>
+            </w:tcBorders>
           </w:tcPr>
           <w:p>
             <w:pPr>
@@ -3028,6 +3059,11 @@
         <w:tc>
           <w:tcPr>
             <w:tcW w:w="0" w:type="auto"/>
+            <w:tcBorders>
+              <w:top w:val="single" w:sz="2" w:space="0" w:color="4E91CD"/>
+              <w:bottom w:val="single" w:sz="2" w:space="0" w:color="4E91CD"/>
+              <w:right w:val="single" w:sz="2" w:space="0" w:color="4E91CD"/>
+            </w:tcBorders>
           </w:tcPr>
           <w:p>
             <w:pPr>
@@ -3053,6 +3089,9 @@
           <w:tcPr>
             <w:cnfStyle w:val="001000000000" w:firstRow="0" w:lastRow="0" w:firstColumn="1" w:lastColumn="0" w:oddVBand="0" w:evenVBand="0" w:oddHBand="0" w:evenHBand="0" w:firstRowFirstColumn="0" w:firstRowLastColumn="0" w:lastRowFirstColumn="0" w:lastRowLastColumn="0"/>
             <w:tcW w:w="553" w:type="pct"/>
+            <w:tcBorders>
+              <w:right w:val="single" w:sz="2" w:space="0" w:color="4E91CD"/>
+            </w:tcBorders>
             <w:hideMark/>
           </w:tcPr>
           <w:p>
@@ -3084,57 +3123,50 @@
         <w:tc>
           <w:tcPr>
             <w:tcW w:w="722" w:type="pct"/>
-            <w:shd w:val="clear" w:color="auto" w:fill="4E91CD"/>
+            <w:tcBorders>
+              <w:top w:val="single" w:sz="2" w:space="0" w:color="4E91CD"/>
+              <w:left w:val="single" w:sz="2" w:space="0" w:color="4E91CD"/>
+              <w:bottom w:val="single" w:sz="2" w:space="0" w:color="4E91CD"/>
+            </w:tcBorders>
           </w:tcPr>
           <w:p>
             <w:pPr>
               <w:pStyle w:val="Contenido"/>
               <w:cnfStyle w:val="000000100000" w:firstRow="0" w:lastRow="0" w:firstColumn="0" w:lastColumn="0" w:oddVBand="0" w:evenVBand="0" w:oddHBand="1" w:evenHBand="0" w:firstRowFirstColumn="0" w:firstRowLastColumn="0" w:lastRowFirstColumn="0" w:lastRowLastColumn="0"/>
-              <w:rPr>
-                <w:color w:val="FFFFFF" w:themeColor="background1"/>
-              </w:rPr>
             </w:pPr>
             <w:r>
               <w:rPr>
                 <w:i/>
-                <w:color w:val="FFFFFF" w:themeColor="background1"/>
               </w:rPr>
               <w:t>11</w:t>
             </w:r>
             <w:r>
               <w:rPr>
                 <w:i/>
-                <w:color w:val="FFFFFF" w:themeColor="background1"/>
               </w:rPr>
               <w:t>/0</w:t>
             </w:r>
             <w:r>
               <w:rPr>
                 <w:i/>
-                <w:color w:val="FFFFFF" w:themeColor="background1"/>
               </w:rPr>
               <w:t>2</w:t>
             </w:r>
             <w:r>
               <w:rPr>
                 <w:i/>
-                <w:color w:val="FFFFFF" w:themeColor="background1"/>
               </w:rPr>
-              <w:t>/202</w:t>
-            </w:r>
-            <w:r>
-              <w:rPr>
-                <w:i/>
-                <w:color w:val="FFFFFF" w:themeColor="background1"/>
-              </w:rPr>
-              <w:t>6</w:t>
+              <w:t>/2026</w:t>
             </w:r>
           </w:p>
         </w:tc>
         <w:tc>
           <w:tcPr>
             <w:tcW w:w="0" w:type="auto"/>
-            <w:shd w:val="clear" w:color="auto" w:fill="4E91CD"/>
+            <w:tcBorders>
+              <w:top w:val="single" w:sz="2" w:space="0" w:color="4E91CD"/>
+              <w:bottom w:val="single" w:sz="2" w:space="0" w:color="4E91CD"/>
+            </w:tcBorders>
           </w:tcPr>
           <w:p>
             <w:pPr>
@@ -3143,39 +3175,38 @@
               <w:rPr>
                 <w:b/>
                 <w:bCs/>
-                <w:color w:val="FFFFFF" w:themeColor="background1"/>
                 <w:sz w:val="18"/>
                 <w:szCs w:val="18"/>
               </w:rPr>
             </w:pPr>
             <w:r>
               <w:rPr>
+                <w:rFonts w:cstheme="minorHAnsi"/>
                 <w:b/>
                 <w:bCs/>
-                <w:color w:val="FFFFFF" w:themeColor="background1"/>
               </w:rPr>
-              <w:t>EN REVISIÓN</w:t>
+              <w:t>Revisión de documento</w:t>
             </w:r>
           </w:p>
         </w:tc>
         <w:tc>
           <w:tcPr>
             <w:tcW w:w="0" w:type="auto"/>
-            <w:shd w:val="clear" w:color="auto" w:fill="4E91CD"/>
+            <w:tcBorders>
+              <w:top w:val="single" w:sz="2" w:space="0" w:color="4E91CD"/>
+              <w:bottom w:val="single" w:sz="2" w:space="0" w:color="4E91CD"/>
+              <w:right w:val="single" w:sz="2" w:space="0" w:color="4E91CD"/>
+            </w:tcBorders>
           </w:tcPr>
           <w:p>
             <w:pPr>
               <w:pStyle w:val="Contenido"/>
               <w:cnfStyle w:val="000000100000" w:firstRow="0" w:lastRow="0" w:firstColumn="0" w:lastColumn="0" w:oddVBand="0" w:evenVBand="0" w:oddHBand="1" w:evenHBand="0" w:firstRowFirstColumn="0" w:firstRowLastColumn="0" w:lastRowFirstColumn="0" w:lastRowLastColumn="0"/>
-              <w:rPr>
-                <w:color w:val="FFFFFF" w:themeColor="background1"/>
-              </w:rPr>
             </w:pPr>
             <w:r>
               <w:rPr>
                 <w:i/>
                 <w:iCs/>
-                <w:color w:val="FFFFFF" w:themeColor="background1"/>
               </w:rPr>
               <w:t>dcueli</w:t>
             </w:r>
@@ -4763,7 +4794,7 @@
           </mc:Choice>
           <mc:Fallback>
             <w:pict>
-              <v:shapetype w14:anchorId="6C1263A5" id="_x0000_t176" coordsize="21600,21600" o:spt="176" adj="2700" path="m@0,qx0@0l0@2qy@0,21600l@1,21600qx21600@2l21600@0qy@1,xe">
+              <v:shapetype w14:anchorId="768D5188" id="_x0000_t176" coordsize="21600,21600" o:spt="176" adj="2700" path="m@0,qx0@0l0@2qy@0,21600l@1,21600qx21600@2l21600@0qy@1,xe">
                 <v:stroke joinstyle="miter"/>
                 <v:formulas>
                   <v:f eqn="val #0"/>
@@ -4854,7 +4885,7 @@
           </mc:Choice>
           <mc:Fallback>
             <w:pict>
-              <v:shape w14:anchorId="3F130D18" id="Diagrama de flujo: proceso alternativo 19" o:spid="_x0000_s1026" type="#_x0000_t176" style="position:absolute;margin-left:173.95pt;margin-top:91.05pt;width:56.05pt;height:19.15pt;z-index:251675648;visibility:visible;mso-wrap-style:square;mso-height-percent:0;mso-wrap-distance-left:9pt;mso-wrap-distance-top:0;mso-wrap-distance-right:9pt;mso-wrap-distance-bottom:0;mso-position-horizontal:absolute;mso-position-horizontal-relative:text;mso-position-vertical:absolute;mso-position-vertical-relative:text;mso-height-percent:0;mso-height-relative:margin;v-text-anchor:middle" o:gfxdata="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" filled="f" strokecolor="white [3212]" strokeweight="2pt"/>
+              <v:shape w14:anchorId="14F87631" id="Diagrama de flujo: proceso alternativo 19" o:spid="_x0000_s1026" type="#_x0000_t176" style="position:absolute;margin-left:173.95pt;margin-top:91.05pt;width:56.05pt;height:19.15pt;z-index:251675648;visibility:visible;mso-wrap-style:square;mso-height-percent:0;mso-wrap-distance-left:9pt;mso-wrap-distance-top:0;mso-wrap-distance-right:9pt;mso-wrap-distance-bottom:0;mso-position-horizontal:absolute;mso-position-horizontal-relative:text;mso-position-vertical:absolute;mso-position-vertical-relative:text;mso-height-percent:0;mso-height-relative:margin;v-text-anchor:middle" o:gfxdata="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" filled="f" strokecolor="white [3212]" strokeweight="2pt"/>
             </w:pict>
           </mc:Fallback>
         </mc:AlternateContent>
@@ -5207,7 +5238,7 @@
           </mc:Choice>
           <mc:Fallback>
             <w:pict>
-              <v:shape w14:anchorId="2262D6BE" id="Flecha: en U 31" o:spid="_x0000_s1026" style="position:absolute;margin-left:272.5pt;margin-top:108.8pt;width:187.4pt;height:33pt;rotation:90;z-index:251692032;visibility:visible;mso-wrap-style:square;mso-width-percent:0;mso-height-percent:0;mso-wrap-distance-left:9pt;mso-wrap-distance-top:0;mso-wrap-distance-right:9pt;mso-wrap-distance-bottom:0;mso-position-horizontal:absolute;mso-position-horizontal-relative:text;mso-position-vertical:absolute;mso-position-vertical-relative:text;mso-width-percent:0;mso-height-percent:0;mso-width-relative:margin;mso-height-relative:margin;v-text-anchor:middle" coordsize="1690181,330741" o:gfxdata="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" path="m,330741l,144699c,64784,64784,,144699,l1545482,v79915,,144699,64784,144699,144699c1690180,199659,1690180,254620,1690179,309580r-82685,-1949c1607495,253320,1607495,199010,1607496,144699v,-34249,-27765,-62014,-62014,-62014l144699,82685v-34249,,-62014,27765,-62014,62014l82685,330741,,330741xe" fillcolor="#242d5b" stroked="f" strokeweight="2pt">
+              <v:shape w14:anchorId="18C68176" id="Flecha: en U 31" o:spid="_x0000_s1026" style="position:absolute;margin-left:272.5pt;margin-top:108.8pt;width:187.4pt;height:33pt;rotation:90;z-index:251692032;visibility:visible;mso-wrap-style:square;mso-width-percent:0;mso-height-percent:0;mso-wrap-distance-left:9pt;mso-wrap-distance-top:0;mso-wrap-distance-right:9pt;mso-wrap-distance-bottom:0;mso-position-horizontal:absolute;mso-position-horizontal-relative:text;mso-position-vertical:absolute;mso-position-vertical-relative:text;mso-width-percent:0;mso-height-percent:0;mso-width-relative:margin;mso-height-relative:margin;v-text-anchor:middle" coordsize="1690181,330741" o:gfxdata="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" path="m,330741l,144699c,64784,64784,,144699,l1545482,v79915,,144699,64784,144699,144699c1690180,199659,1690180,254620,1690179,309580r-82685,-1949c1607495,253320,1607495,199010,1607496,144699v,-34249,-27765,-62014,-62014,-62014l144699,82685v-34249,,-62014,27765,-62014,62014l82685,330741,,330741xe" fillcolor="#242d5b" stroked="f" strokeweight="2pt">
                 <v:path arrowok="t" o:connecttype="custom" o:connectlocs="0,419417;0,183495;203753,0;2176213,0;2379966,183495;2379963,392582;2263533,390111;2263536,183495;2176213,104854;203753,104854;116430,183495;116430,419417;0,419417" o:connectangles="0,0,0,0,0,0,0,0,0,0,0,0,0"/>
                 <o:lock v:ext="edit" aspectratio="t"/>
               </v:shape>
@@ -5563,7 +5594,7 @@
           </mc:Choice>
           <mc:Fallback>
             <w:pict>
-              <v:shape w14:anchorId="29687BB2" id="Flecha: en U 31" o:spid="_x0000_s1026" style="position:absolute;margin-left:46.1pt;margin-top:105.4pt;width:183.55pt;height:37.4pt;rotation:-90;z-index:251686911;visibility:visible;mso-wrap-style:square;mso-width-percent:0;mso-height-percent:0;mso-wrap-distance-left:9pt;mso-wrap-distance-top:0;mso-wrap-distance-right:9pt;mso-wrap-distance-bottom:0;mso-position-horizontal:absolute;mso-position-horizontal-relative:text;mso-position-vertical:absolute;mso-position-vertical-relative:text;mso-width-percent:0;mso-height-percent:0;mso-width-relative:margin;mso-height-relative:margin;v-text-anchor:middle" coordsize="1690181,330741" o:gfxdata="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" path="m,330741l,144699c,64784,64784,,144699,l1545482,v79915,,144699,64784,144699,144699c1690180,199659,1690180,254620,1690179,309580r-82685,-1949c1607495,253320,1607495,199010,1607496,144699v,-34249,-27765,-62014,-62014,-62014l144699,82685v-34249,,-62014,27765,-62014,62014l82685,330741,,330741xe" fillcolor="#242d5b" stroked="f" strokeweight="2pt">
+              <v:shape w14:anchorId="682B237C" id="Flecha: en U 31" o:spid="_x0000_s1026" style="position:absolute;margin-left:46.1pt;margin-top:105.4pt;width:183.55pt;height:37.4pt;rotation:-90;z-index:251686911;visibility:visible;mso-wrap-style:square;mso-width-percent:0;mso-height-percent:0;mso-wrap-distance-left:9pt;mso-wrap-distance-top:0;mso-wrap-distance-right:9pt;mso-wrap-distance-bottom:0;mso-position-horizontal:absolute;mso-position-horizontal-relative:text;mso-position-vertical:absolute;mso-position-vertical-relative:text;mso-width-percent:0;mso-height-percent:0;mso-width-relative:margin;mso-height-relative:margin;v-text-anchor:middle" coordsize="1690181,330741" o:gfxdata="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" path="m,330741l,144699c,64784,64784,,144699,l1545482,v79915,,144699,64784,144699,144699c1690180,199659,1690180,254620,1690179,309580r-82685,-1949c1607495,253320,1607495,199010,1607496,144699v,-34249,-27765,-62014,-62014,-62014l144699,82685v-34249,,-62014,27765,-62014,62014l82685,330741,,330741xe" fillcolor="#242d5b" stroked="f" strokeweight="2pt">
                 <v:path arrowok="t" o:connecttype="custom" o:connectlocs="0,475200;0,207900;199565,0;2131492,0;2331057,207900;2331054,444796;2217017,441996;2217020,207900;2131492,118800;199565,118800;114037,207900;114037,475200;0,475200" o:connectangles="0,0,0,0,0,0,0,0,0,0,0,0,0"/>
                 <o:lock v:ext="edit" aspectratio="t"/>
               </v:shape>
@@ -5646,7 +5677,7 @@
           </mc:Choice>
           <mc:Fallback>
             <w:pict>
-              <v:shapetype w14:anchorId="30C391D8" id="_x0000_t70" coordsize="21600,21600" o:spt="70" adj="5400,4320" path="m10800,l21600@0@3@0@3@2,21600@2,10800,21600,0@2@1@2@1@0,0@0xe">
+              <v:shapetype w14:anchorId="01B2AB49" id="_x0000_t70" coordsize="21600,21600" o:spt="70" adj="5400,4320" path="m10800,l21600@0@3@0@3@2,21600@2,10800,21600,0@2@1@2@1@0,0@0xe">
                 <v:stroke joinstyle="miter"/>
                 <v:formulas>
                   <v:f eqn="val #1"/>
@@ -5744,7 +5775,7 @@
           </mc:Choice>
           <mc:Fallback>
             <w:pict>
-              <v:shape w14:anchorId="7C6C9368" id="Flecha: arriba y abajo 13" o:spid="_x0000_s1026" type="#_x0000_t70" style="position:absolute;margin-left:246.9pt;margin-top:122.7pt;width:7.9pt;height:13.4pt;z-index:251681792;visibility:visible;mso-wrap-style:square;mso-width-percent:0;mso-height-percent:0;mso-wrap-distance-left:9pt;mso-wrap-distance-top:0;mso-wrap-distance-right:9pt;mso-wrap-distance-bottom:0;mso-position-horizontal:absolute;mso-position-horizontal-relative:margin;mso-position-vertical:absolute;mso-position-vertical-relative:text;mso-width-percent:0;mso-height-percent:0;mso-width-relative:margin;mso-height-relative:margin;v-text-anchor:middle" o:gfxdata="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" adj=",6367" fillcolor="#242d5b" stroked="f" strokeweight="2pt">
+              <v:shape w14:anchorId="5BCDBF27" id="Flecha: arriba y abajo 13" o:spid="_x0000_s1026" type="#_x0000_t70" style="position:absolute;margin-left:246.9pt;margin-top:122.7pt;width:7.9pt;height:13.4pt;z-index:251681792;visibility:visible;mso-wrap-style:square;mso-width-percent:0;mso-height-percent:0;mso-wrap-distance-left:9pt;mso-wrap-distance-top:0;mso-wrap-distance-right:9pt;mso-wrap-distance-bottom:0;mso-position-horizontal:absolute;mso-position-horizontal-relative:margin;mso-position-vertical:absolute;mso-position-vertical-relative:text;mso-width-percent:0;mso-height-percent:0;mso-width-relative:margin;mso-height-relative:margin;v-text-anchor:middle" o:gfxdata="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" adj=",6367" fillcolor="#242d5b" stroked="f" strokeweight="2pt">
                 <w10:wrap anchorx="margin"/>
               </v:shape>
             </w:pict>
@@ -6145,7 +6176,7 @@
           </mc:Choice>
           <mc:Fallback>
             <w:pict>
-              <v:shape w14:anchorId="6E67A949" id="Flecha: arriba y abajo 13" o:spid="_x0000_s1026" type="#_x0000_t70" style="position:absolute;margin-left:247.05pt;margin-top:52.45pt;width:7.9pt;height:13.4pt;z-index:251670528;visibility:visible;mso-wrap-style:square;mso-width-percent:0;mso-height-percent:0;mso-wrap-distance-left:9pt;mso-wrap-distance-top:0;mso-wrap-distance-right:9pt;mso-wrap-distance-bottom:0;mso-position-horizontal:absolute;mso-position-horizontal-relative:margin;mso-position-vertical:absolute;mso-position-vertical-relative:text;mso-width-percent:0;mso-height-percent:0;mso-width-relative:margin;mso-height-relative:margin;v-text-anchor:middle" o:gfxdata="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" adj=",6367" fillcolor="#242d5b" stroked="f" strokeweight="2pt">
+              <v:shape w14:anchorId="17445DCA" id="Flecha: arriba y abajo 13" o:spid="_x0000_s1026" type="#_x0000_t70" style="position:absolute;margin-left:247.05pt;margin-top:52.45pt;width:7.9pt;height:13.4pt;z-index:251670528;visibility:visible;mso-wrap-style:square;mso-width-percent:0;mso-height-percent:0;mso-wrap-distance-left:9pt;mso-wrap-distance-top:0;mso-wrap-distance-right:9pt;mso-wrap-distance-bottom:0;mso-position-horizontal:absolute;mso-position-horizontal-relative:margin;mso-position-vertical:absolute;mso-position-vertical-relative:text;mso-width-percent:0;mso-height-percent:0;mso-width-relative:margin;mso-height-relative:margin;v-text-anchor:middle" o:gfxdata="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" adj=",6367" fillcolor="#242d5b" stroked="f" strokeweight="2pt">
                 <w10:wrap anchorx="margin"/>
               </v:shape>
             </w:pict>
@@ -6851,7 +6882,7 @@
           </mc:Choice>
           <mc:Fallback>
             <w:pict>
-              <v:shape w14:anchorId="480173FD" id="Diagrama de flujo: proceso alternativo 19" o:spid="_x0000_s1026" type="#_x0000_t176" style="position:absolute;margin-left:152.65pt;margin-top:197.65pt;width:51.9pt;height:19.05pt;z-index:251688959;visibility:visible;mso-wrap-style:square;mso-width-percent:0;mso-height-percent:0;mso-wrap-distance-left:9pt;mso-wrap-distance-top:0;mso-wrap-distance-right:9pt;mso-wrap-distance-bottom:0;mso-position-horizontal:absolute;mso-position-horizontal-relative:text;mso-position-vertical:absolute;mso-position-vertical-relative:text;mso-width-percent:0;mso-height-percent:0;mso-width-relative:margin;mso-height-relative:margin;v-text-anchor:middle" o:gfxdata="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" filled="f" strokecolor="white [3212]" strokeweight="2pt"/>
+              <v:shape w14:anchorId="73DA256E" id="Diagrama de flujo: proceso alternativo 19" o:spid="_x0000_s1026" type="#_x0000_t176" style="position:absolute;margin-left:152.65pt;margin-top:197.65pt;width:51.9pt;height:19.05pt;z-index:251688959;visibility:visible;mso-wrap-style:square;mso-width-percent:0;mso-height-percent:0;mso-wrap-distance-left:9pt;mso-wrap-distance-top:0;mso-wrap-distance-right:9pt;mso-wrap-distance-bottom:0;mso-position-horizontal:absolute;mso-position-horizontal-relative:text;mso-position-vertical:absolute;mso-position-vertical-relative:text;mso-width-percent:0;mso-height-percent:0;mso-width-relative:margin;mso-height-relative:margin;v-text-anchor:middle" o:gfxdata="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" filled="f" strokecolor="white [3212]" strokeweight="2pt"/>
             </w:pict>
           </mc:Fallback>
         </mc:AlternateContent>
@@ -6929,7 +6960,7 @@
           </mc:Choice>
           <mc:Fallback>
             <w:pict>
-              <v:shape w14:anchorId="324D4313" id="Diagrama de flujo: proceso alternativo 19" o:spid="_x0000_s1026" type="#_x0000_t176" style="position:absolute;margin-left:211.65pt;margin-top:197.65pt;width:38.95pt;height:19.1pt;z-index:251687936;visibility:visible;mso-wrap-style:square;mso-width-percent:0;mso-height-percent:0;mso-wrap-distance-left:9pt;mso-wrap-distance-top:0;mso-wrap-distance-right:9pt;mso-wrap-distance-bottom:0;mso-position-horizontal:absolute;mso-position-horizontal-relative:text;mso-position-vertical:absolute;mso-position-vertical-relative:text;mso-width-percent:0;mso-height-percent:0;mso-width-relative:margin;mso-height-relative:margin;v-text-anchor:middle" o:gfxdata="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" filled="f" strokecolor="white [3212]" strokeweight="2pt"/>
+              <v:shape w14:anchorId="23E27A14" id="Diagrama de flujo: proceso alternativo 19" o:spid="_x0000_s1026" type="#_x0000_t176" style="position:absolute;margin-left:211.65pt;margin-top:197.65pt;width:38.95pt;height:19.1pt;z-index:251687936;visibility:visible;mso-wrap-style:square;mso-width-percent:0;mso-height-percent:0;mso-wrap-distance-left:9pt;mso-wrap-distance-top:0;mso-wrap-distance-right:9pt;mso-wrap-distance-bottom:0;mso-position-horizontal:absolute;mso-position-horizontal-relative:text;mso-position-vertical:absolute;mso-position-vertical-relative:text;mso-width-percent:0;mso-height-percent:0;mso-width-relative:margin;mso-height-relative:margin;v-text-anchor:middle" o:gfxdata="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" filled="f" strokecolor="white [3212]" strokeweight="2pt"/>
             </w:pict>
           </mc:Fallback>
         </mc:AlternateContent>
@@ -7007,7 +7038,7 @@
           </mc:Choice>
           <mc:Fallback>
             <w:pict>
-              <v:shape w14:anchorId="09DB891D" id="Diagrama de flujo: proceso alternativo 19" o:spid="_x0000_s1026" type="#_x0000_t176" style="position:absolute;margin-left:259.4pt;margin-top:187.95pt;width:84.95pt;height:38.25pt;z-index:251685888;visibility:visible;mso-wrap-style:square;mso-width-percent:0;mso-height-percent:0;mso-wrap-distance-left:9pt;mso-wrap-distance-top:0;mso-wrap-distance-right:9pt;mso-wrap-distance-bottom:0;mso-position-horizontal:absolute;mso-position-horizontal-relative:text;mso-position-vertical:absolute;mso-position-vertical-relative:text;mso-width-percent:0;mso-height-percent:0;mso-width-relative:margin;mso-height-relative:margin;v-text-anchor:middle" o:gfxdata="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" filled="f" strokecolor="white [3212]" strokeweight="2pt"/>
+              <v:shape w14:anchorId="48BD8A9A" id="Diagrama de flujo: proceso alternativo 19" o:spid="_x0000_s1026" type="#_x0000_t176" style="position:absolute;margin-left:259.4pt;margin-top:187.95pt;width:84.95pt;height:38.25pt;z-index:251685888;visibility:visible;mso-wrap-style:square;mso-width-percent:0;mso-height-percent:0;mso-wrap-distance-left:9pt;mso-wrap-distance-top:0;mso-wrap-distance-right:9pt;mso-wrap-distance-bottom:0;mso-position-horizontal:absolute;mso-position-horizontal-relative:text;mso-position-vertical:absolute;mso-position-vertical-relative:text;mso-width-percent:0;mso-height-percent:0;mso-width-relative:margin;mso-height-relative:margin;v-text-anchor:middle" o:gfxdata="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" filled="f" strokecolor="white [3212]" strokeweight="2pt"/>
             </w:pict>
           </mc:Fallback>
         </mc:AlternateContent>
@@ -51046,6 +51077,262 @@
       </w:tcPr>
     </w:tblStylePr>
   </w:style>
+  <w:style w:type="table" w:styleId="Tablaconcuadrcula3-nfasis2">
+    <w:name w:val="Grid Table 3 Accent 2"/>
+    <w:basedOn w:val="Tablanormal"/>
+    <w:uiPriority w:val="48"/>
+    <w:rsid w:val="00FB4C3D"/>
+    <w:pPr>
+      <w:spacing w:after="0" w:line="240" w:lineRule="auto"/>
+    </w:pPr>
+    <w:tblPr>
+      <w:tblStyleRowBandSize w:val="1"/>
+      <w:tblStyleColBandSize w:val="1"/>
+      <w:tblBorders>
+        <w:top w:val="single" w:sz="4" w:space="0" w:color="85BDE2" w:themeColor="accent2" w:themeTint="99"/>
+        <w:left w:val="single" w:sz="4" w:space="0" w:color="85BDE2" w:themeColor="accent2" w:themeTint="99"/>
+        <w:bottom w:val="single" w:sz="4" w:space="0" w:color="85BDE2" w:themeColor="accent2" w:themeTint="99"/>
+        <w:right w:val="single" w:sz="4" w:space="0" w:color="85BDE2" w:themeColor="accent2" w:themeTint="99"/>
+        <w:insideH w:val="single" w:sz="4" w:space="0" w:color="85BDE2" w:themeColor="accent2" w:themeTint="99"/>
+        <w:insideV w:val="single" w:sz="4" w:space="0" w:color="85BDE2" w:themeColor="accent2" w:themeTint="99"/>
+      </w:tblBorders>
+    </w:tblPr>
+    <w:tblStylePr w:type="firstRow">
+      <w:rPr>
+        <w:b/>
+        <w:bCs/>
+      </w:rPr>
+      <w:tblPr/>
+      <w:tcPr>
+        <w:tcBorders>
+          <w:top w:val="nil"/>
+          <w:left w:val="nil"/>
+          <w:right w:val="nil"/>
+          <w:insideH w:val="nil"/>
+          <w:insideV w:val="nil"/>
+        </w:tcBorders>
+        <w:shd w:val="clear" w:color="auto" w:fill="FFFFFF" w:themeFill="background1"/>
+      </w:tcPr>
+    </w:tblStylePr>
+    <w:tblStylePr w:type="lastRow">
+      <w:rPr>
+        <w:b/>
+        <w:bCs/>
+      </w:rPr>
+      <w:tblPr/>
+      <w:tcPr>
+        <w:tcBorders>
+          <w:left w:val="nil"/>
+          <w:bottom w:val="nil"/>
+          <w:right w:val="nil"/>
+          <w:insideH w:val="nil"/>
+          <w:insideV w:val="nil"/>
+        </w:tcBorders>
+        <w:shd w:val="clear" w:color="auto" w:fill="FFFFFF" w:themeFill="background1"/>
+      </w:tcPr>
+    </w:tblStylePr>
+    <w:tblStylePr w:type="firstCol">
+      <w:pPr>
+        <w:jc w:val="right"/>
+      </w:pPr>
+      <w:rPr>
+        <w:i/>
+        <w:iCs/>
+      </w:rPr>
+      <w:tblPr/>
+      <w:tcPr>
+        <w:tcBorders>
+          <w:top w:val="nil"/>
+          <w:left w:val="nil"/>
+          <w:bottom w:val="nil"/>
+          <w:insideH w:val="nil"/>
+          <w:insideV w:val="nil"/>
+        </w:tcBorders>
+        <w:shd w:val="clear" w:color="auto" w:fill="FFFFFF" w:themeFill="background1"/>
+      </w:tcPr>
+    </w:tblStylePr>
+    <w:tblStylePr w:type="lastCol">
+      <w:rPr>
+        <w:i/>
+        <w:iCs/>
+      </w:rPr>
+      <w:tblPr/>
+      <w:tcPr>
+        <w:tcBorders>
+          <w:top w:val="nil"/>
+          <w:bottom w:val="nil"/>
+          <w:right w:val="nil"/>
+          <w:insideH w:val="nil"/>
+          <w:insideV w:val="nil"/>
+        </w:tcBorders>
+        <w:shd w:val="clear" w:color="auto" w:fill="FFFFFF" w:themeFill="background1"/>
+      </w:tcPr>
+    </w:tblStylePr>
+    <w:tblStylePr w:type="band1Vert">
+      <w:tblPr/>
+      <w:tcPr>
+        <w:shd w:val="clear" w:color="auto" w:fill="D6E9F5" w:themeFill="accent2" w:themeFillTint="33"/>
+      </w:tcPr>
+    </w:tblStylePr>
+    <w:tblStylePr w:type="band1Horz">
+      <w:tblPr/>
+      <w:tcPr>
+        <w:shd w:val="clear" w:color="auto" w:fill="D6E9F5" w:themeFill="accent2" w:themeFillTint="33"/>
+      </w:tcPr>
+    </w:tblStylePr>
+    <w:tblStylePr w:type="neCell">
+      <w:tblPr/>
+      <w:tcPr>
+        <w:tcBorders>
+          <w:bottom w:val="single" w:sz="4" w:space="0" w:color="85BDE2" w:themeColor="accent2" w:themeTint="99"/>
+        </w:tcBorders>
+      </w:tcPr>
+    </w:tblStylePr>
+    <w:tblStylePr w:type="nwCell">
+      <w:tblPr/>
+      <w:tcPr>
+        <w:tcBorders>
+          <w:bottom w:val="single" w:sz="4" w:space="0" w:color="85BDE2" w:themeColor="accent2" w:themeTint="99"/>
+        </w:tcBorders>
+      </w:tcPr>
+    </w:tblStylePr>
+    <w:tblStylePr w:type="seCell">
+      <w:tblPr/>
+      <w:tcPr>
+        <w:tcBorders>
+          <w:top w:val="single" w:sz="4" w:space="0" w:color="85BDE2" w:themeColor="accent2" w:themeTint="99"/>
+        </w:tcBorders>
+      </w:tcPr>
+    </w:tblStylePr>
+    <w:tblStylePr w:type="swCell">
+      <w:tblPr/>
+      <w:tcPr>
+        <w:tcBorders>
+          <w:top w:val="single" w:sz="4" w:space="0" w:color="85BDE2" w:themeColor="accent2" w:themeTint="99"/>
+        </w:tcBorders>
+      </w:tcPr>
+    </w:tblStylePr>
+  </w:style>
+  <w:style w:type="table" w:styleId="Tablanormal5">
+    <w:name w:val="Plain Table 5"/>
+    <w:basedOn w:val="Tablanormal"/>
+    <w:uiPriority w:val="45"/>
+    <w:rsid w:val="00FB4C3D"/>
+    <w:pPr>
+      <w:spacing w:after="0" w:line="240" w:lineRule="auto"/>
+    </w:pPr>
+    <w:tblPr>
+      <w:tblStyleRowBandSize w:val="1"/>
+      <w:tblStyleColBandSize w:val="1"/>
+    </w:tblPr>
+    <w:tblStylePr w:type="firstRow">
+      <w:rPr>
+        <w:rFonts w:asciiTheme="majorHAnsi" w:eastAsiaTheme="majorEastAsia" w:hAnsiTheme="majorHAnsi" w:cstheme="majorBidi"/>
+        <w:i/>
+        <w:iCs/>
+        <w:sz w:val="26"/>
+      </w:rPr>
+      <w:tblPr/>
+      <w:tcPr>
+        <w:tcBorders>
+          <w:bottom w:val="single" w:sz="4" w:space="0" w:color="5951C8" w:themeColor="text1" w:themeTint="80"/>
+        </w:tcBorders>
+        <w:shd w:val="clear" w:color="auto" w:fill="FFFFFF" w:themeFill="background1"/>
+      </w:tcPr>
+    </w:tblStylePr>
+    <w:tblStylePr w:type="lastRow">
+      <w:rPr>
+        <w:rFonts w:asciiTheme="majorHAnsi" w:eastAsiaTheme="majorEastAsia" w:hAnsiTheme="majorHAnsi" w:cstheme="majorBidi"/>
+        <w:i/>
+        <w:iCs/>
+        <w:sz w:val="26"/>
+      </w:rPr>
+      <w:tblPr/>
+      <w:tcPr>
+        <w:tcBorders>
+          <w:top w:val="single" w:sz="4" w:space="0" w:color="5951C8" w:themeColor="text1" w:themeTint="80"/>
+        </w:tcBorders>
+        <w:shd w:val="clear" w:color="auto" w:fill="FFFFFF" w:themeFill="background1"/>
+      </w:tcPr>
+    </w:tblStylePr>
+    <w:tblStylePr w:type="firstCol">
+      <w:pPr>
+        <w:jc w:val="right"/>
+      </w:pPr>
+      <w:rPr>
+        <w:rFonts w:asciiTheme="majorHAnsi" w:eastAsiaTheme="majorEastAsia" w:hAnsiTheme="majorHAnsi" w:cstheme="majorBidi"/>
+        <w:i/>
+        <w:iCs/>
+        <w:sz w:val="26"/>
+      </w:rPr>
+      <w:tblPr/>
+      <w:tcPr>
+        <w:tcBorders>
+          <w:right w:val="single" w:sz="4" w:space="0" w:color="5951C8" w:themeColor="text1" w:themeTint="80"/>
+        </w:tcBorders>
+        <w:shd w:val="clear" w:color="auto" w:fill="FFFFFF" w:themeFill="background1"/>
+      </w:tcPr>
+    </w:tblStylePr>
+    <w:tblStylePr w:type="lastCol">
+      <w:rPr>
+        <w:rFonts w:asciiTheme="majorHAnsi" w:eastAsiaTheme="majorEastAsia" w:hAnsiTheme="majorHAnsi" w:cstheme="majorBidi"/>
+        <w:i/>
+        <w:iCs/>
+        <w:sz w:val="26"/>
+      </w:rPr>
+      <w:tblPr/>
+      <w:tcPr>
+        <w:tcBorders>
+          <w:left w:val="single" w:sz="4" w:space="0" w:color="5951C8" w:themeColor="text1" w:themeTint="80"/>
+        </w:tcBorders>
+        <w:shd w:val="clear" w:color="auto" w:fill="FFFFFF" w:themeFill="background1"/>
+      </w:tcPr>
+    </w:tblStylePr>
+    <w:tblStylePr w:type="band1Vert">
+      <w:tblPr/>
+      <w:tcPr>
+        <w:shd w:val="clear" w:color="auto" w:fill="F2F2F2" w:themeFill="background1" w:themeFillShade="F2"/>
+      </w:tcPr>
+    </w:tblStylePr>
+    <w:tblStylePr w:type="band1Horz">
+      <w:tblPr/>
+      <w:tcPr>
+        <w:shd w:val="clear" w:color="auto" w:fill="F2F2F2" w:themeFill="background1" w:themeFillShade="F2"/>
+      </w:tcPr>
+    </w:tblStylePr>
+    <w:tblStylePr w:type="neCell">
+      <w:tblPr/>
+      <w:tcPr>
+        <w:tcBorders>
+          <w:left w:val="nil"/>
+        </w:tcBorders>
+      </w:tcPr>
+    </w:tblStylePr>
+    <w:tblStylePr w:type="nwCell">
+      <w:tblPr/>
+      <w:tcPr>
+        <w:tcBorders>
+          <w:right w:val="nil"/>
+        </w:tcBorders>
+      </w:tcPr>
+    </w:tblStylePr>
+    <w:tblStylePr w:type="seCell">
+      <w:tblPr/>
+      <w:tcPr>
+        <w:tcBorders>
+          <w:left w:val="nil"/>
+        </w:tcBorders>
+      </w:tcPr>
+    </w:tblStylePr>
+    <w:tblStylePr w:type="swCell">
+      <w:tblPr/>
+      <w:tcPr>
+        <w:tcBorders>
+          <w:right w:val="nil"/>
+        </w:tcBorders>
+      </w:tcPr>
+    </w:tblStylePr>
+  </w:style>
 </w:styles>
 </file>
 
@@ -51267,10 +51554,10 @@
     <w:rsid w:val="00130F2A"/>
     <w:rsid w:val="00204B26"/>
     <w:rsid w:val="0023140F"/>
-    <w:rsid w:val="002A0944"/>
     <w:rsid w:val="002C5662"/>
     <w:rsid w:val="003B6919"/>
     <w:rsid w:val="004010E7"/>
+    <w:rsid w:val="00451158"/>
     <w:rsid w:val="0048444B"/>
     <w:rsid w:val="00491E1D"/>
     <w:rsid w:val="005B625B"/>

</xml_diff>